<commit_message>
update hoan hoanung policy
</commit_message>
<xml_diff>
--- a/data/testcase_uc3_v2/02_hop_le_chung_tu/02_hop_le_chung_tu-tc08_khong_phan_loai_duoc_chung_tu/chung_tu_DOC-1808.docx
+++ b/data/testcase_uc3_v2/02_hop_le_chung_tu/02_hop_le_chung_tu-tc08_khong_phan_loai_duoc_chung_tu/chung_tu_DOC-1808.docx
@@ -16,7 +16,7 @@
     </w:p>
     <w:p>
       <w:r>
-        <w:t>Đơn vị phát hành: Đơn vị không xác định</w:t>
+        <w:t>Đơn vị phát hành: Đơn vị đối tác</w:t>
       </w:r>
     </w:p>
     <w:p>
@@ -125,7 +125,7 @@
               <w:rPr>
                 <w:sz w:val="18"/>
               </w:rPr>
-              <w:t>Tài liệu không rõ loại</w:t>
+              <w:t>Giấy xác nhận thanh toán dịch vụ</w:t>
             </w:r>
           </w:p>
         </w:tc>

</xml_diff>